<commit_message>
Add AI whiteboard prompts to every guide
- board_spec.py reads each board's SVG (sections, positions, colours,
  prompts and fields) and builds a tool-neutral prompt for Miro AI,
  Atlassian Rovo or any assistant
- "Recreate it in your whiteboard" section with copy button on every
  guide page (hidden in print) and in the Word guides
- README and CLAUDE.md describe the new script

Co-Authored-By: Claude Opus 5.5 <noreply@anthropic.com>
</commit_message>
<xml_diff>
--- a/facilitator-guide-adkar.docx
+++ b/facilitator-guide-adkar.docx
@@ -994,6 +994,162 @@
       </w:r>
       <w:r>
         <w:t xml:space="preserve"> to show the change is paying off.</w:t>
+      </w:r>
+    </w:p>
+    <w:p>
+      <w:pPr>
+        <w:pStyle w:val="Heading1"/>
+      </w:pPr>
+      <w:r>
+        <w:t xml:space="preserve">Recreate it in your whiteboard</w:t>
+      </w:r>
+    </w:p>
+    <w:p>
+      <w:pPr>
+        <w:pStyle w:val="Small"/>
+      </w:pPr>
+      <w:r>
+        <w:t xml:space="preserve">Paste this into your whiteboard's AI assistant (for example Miro AI or Atlassian Rovo) or a general assistant, to get an editable, native version of the board. Results vary by tool, so expect to tidy it up. For an exact copy, import the SVG as a locked background instead.</w:t>
+      </w:r>
+    </w:p>
+    <w:p>
+      <w:r>
+        <w:t xml:space="preserve">Create an editable whiteboard for “ADKAR Change Readiness”, a workshop board.</w:t>
+      </w:r>
+    </w:p>
+    <w:p>
+      <w:r>
+        <w:t xml:space="preserve">Purpose: Find where people are in a change, spot the barrier point, and act on it before moving on.</w:t>
+      </w:r>
+    </w:p>
+    <w:p>
+      <w:r>
+        <w:t xml:space="preserve">Layout: a wide landscape board (about 16:11). Make one frame per section below, placed as described. In each frame, add the section name as a heading, then its content as short text labels or empty fields to fill in. Leave space in each frame for sticky notes. Use the header colour given. Keep the wording as written and don't add extra content.</w:t>
+      </w:r>
+    </w:p>
+    <w:p>
+      <w:r>
+        <w:t xml:space="preserve">Header fields to fill in: Change, Sponsor</w:t>
+      </w:r>
+    </w:p>
+    <w:p>
+      <w:r>
+        <w:t xml:space="preserve">Sections:</w:t>
+      </w:r>
+    </w:p>
+    <w:p>
+      <w:r>
+        <w:t xml:space="preserve">1. Change on a Page: top full width, about 100% wide and 15% tall; header colour slate grey.</w:t>
+      </w:r>
+    </w:p>
+    <w:p>
+      <w:r>
+        <w:t xml:space="preserve">   Subtitle: What, why, who, when</w:t>
+      </w:r>
+    </w:p>
+    <w:p>
+      <w:r>
+        <w:t xml:space="preserve">   Content: What's changing: · Who's affected: · Why now: · Key dates:</w:t>
+      </w:r>
+    </w:p>
+    <w:p>
+      <w:r>
+        <w:t xml:space="preserve">2. Readiness Grid: middle full width, about 100% wide and 35% tall; header colour slate grey.</w:t>
+      </w:r>
+    </w:p>
+    <w:p>
+      <w:r>
+        <w:t xml:space="preserve">   Subtitle: Score 1–5 · the first low score is the barrier point</w:t>
+      </w:r>
+    </w:p>
+    <w:p>
+      <w:r>
+        <w:t xml:space="preserve">   Content: Person or group: · A · awareness: · D · desire: · K · knowledge: · A · ability: · R · reinforcement: · Barrier point: · 1. 2 (×15) · 3. 4 (×15) · 5. 1 (×10) · 2. 3 (×10) · 4. 5 (×10) · 5 (×5) · Circle each score. Scores run 1 (not at all) to 5 (fully). The barrier point is the first element scored 3 or lower, working left to right. Fix it before working on later elements.</w:t>
+      </w:r>
+    </w:p>
+    <w:p>
+      <w:r>
+        <w:t xml:space="preserve">3. Awareness: bottom left, about 20% wide and 25% tall.</w:t>
+      </w:r>
+    </w:p>
+    <w:p>
+      <w:r>
+        <w:t xml:space="preserve">   Content: Missing if…: · People ask “why are we doing this?” Rumours fill the silence · What helps: · Sponsor explains the why, early and often · Share the cost of not changing · Our action:</w:t>
+      </w:r>
+    </w:p>
+    <w:p>
+      <w:r>
+        <w:t xml:space="preserve">4. Desire: bottom left, about 20% wide and 25% tall; header colour purple.</w:t>
+      </w:r>
+    </w:p>
+    <w:p>
+      <w:r>
+        <w:t xml:space="preserve">   Content: Missing if…: · People understand, but resist or stall “What's in it for me?” is unanswered · What helps: · Involve people in shaping the change · Managers discuss concerns one-to-one · Our action:</w:t>
+      </w:r>
+    </w:p>
+    <w:p>
+      <w:r>
+        <w:t xml:space="preserve">5. Knowledge: bottom centre, about 20% wide and 25% tall; header colour sky blue.</w:t>
+      </w:r>
+    </w:p>
+    <w:p>
+      <w:r>
+        <w:t xml:space="preserve">   Content: Missing if…: · Willing, but unsure what to do Lots of “how do I…?” questions · What helps: · Training, guides and worked examples · Show the new way on real work · Our action:</w:t>
+      </w:r>
+    </w:p>
+    <w:p>
+      <w:r>
+        <w:t xml:space="preserve">6. Ability: bottom right, about 20% wide and 25% tall.</w:t>
+      </w:r>
+    </w:p>
+    <w:p>
+      <w:r>
+        <w:t xml:space="preserve">   Content: Missing if…: · Know how, but can't do it yet Old habits return under pressure · What helps: · Coaching, pairing and practice time · Remove blockers: tools, time, access · Our action:</w:t>
+      </w:r>
+    </w:p>
+    <w:p>
+      <w:r>
+        <w:t xml:space="preserve">7. Reinforcement: bottom right, about 20% wide and 25% tall; header colour orange.</w:t>
+      </w:r>
+    </w:p>
+    <w:p>
+      <w:r>
+        <w:t xml:space="preserve">   Content: Missing if…: · Early wins, then people slide back The old way is still rewarded · What helps: · Recognise and celebrate adoption · Measure use; fix what pulls people back · Our action:</w:t>
+      </w:r>
+    </w:p>
+    <w:p>
+      <w:r>
+        <w:t xml:space="preserve">8. Action Plan: bottom left, about 65% wide and 15% tall; header colour red.</w:t>
+      </w:r>
+    </w:p>
+    <w:p>
+      <w:r>
+        <w:t xml:space="preserve">   Subtitle: One action per barrier point</w:t>
+      </w:r>
+    </w:p>
+    <w:p>
+      <w:r>
+        <w:t xml:space="preserve">   Content: Who (person or group): · Barrier point: · Action: · Owner: · By when:</w:t>
+      </w:r>
+    </w:p>
+    <w:p>
+      <w:r>
+        <w:t xml:space="preserve">9. Reinforce &amp; Re-assess: bottom right, about 35% wide and 15% tall; header colour dark green.</w:t>
+      </w:r>
+    </w:p>
+    <w:p>
+      <w:r>
+        <w:t xml:space="preserve">   Content: We'll recognise success by: · We'll measure adoption by: · Re-assess on:</w:t>
+      </w:r>
+    </w:p>
+    <w:p>
+      <w:r>
+        <w:t xml:space="preserve">Footer questions: “Where is each group in this change, really?” “What's the first thing stopping them, and what would help most?”</w:t>
+      </w:r>
+    </w:p>
+    <w:p>
+      <w:r>
+        <w:t xml:space="preserve">Original board for reference: https://eparker71.github.io/agile-ways-of-working/adkar-board.html</w:t>
       </w:r>
     </w:p>
     <w:p>

</xml_diff>